<commit_message>
feat: enrich Storyline 360 courseware from Articulate guides
</commit_message>
<xml_diff>
--- a/courseware/LG-Mastering Articulate Storyline 360 for e-Learning Content Creation.docx
+++ b/courseware/LG-Mastering Articulate Storyline 360 for e-Learning Content Creation.docx
@@ -179,7 +179,7 @@
           <w:color w:val="1F6FEB"/>
           <w:sz w:val="24"/>
         </w:rPr>
-        <w:t>Version 9</w:t>
+        <w:t>Version 10</w:t>
       </w:r>
     </w:p>
     <w:p>
@@ -352,7 +352,7 @@
               <w:rPr>
                 <w:sz w:val="19"/>
               </w:rPr>
-              <w:t>9</w:t>
+              <w:t>9.0</w:t>
             </w:r>
           </w:p>
         </w:tc>
@@ -399,6 +399,64 @@
           </w:p>
         </w:tc>
       </w:tr>
+      <w:tr>
+        <w:tc>
+          <w:tcPr>
+            <w:tcW w:type="dxa" w:w="2160"/>
+          </w:tcPr>
+          <w:p>
+            <w:r/>
+            <w:r>
+              <w:rPr>
+                <w:sz w:val="19"/>
+              </w:rPr>
+              <w:t>10</w:t>
+            </w:r>
+          </w:p>
+        </w:tc>
+        <w:tc>
+          <w:tcPr>
+            <w:tcW w:type="dxa" w:w="2160"/>
+          </w:tcPr>
+          <w:p>
+            <w:r/>
+            <w:r>
+              <w:rPr>
+                <w:sz w:val="19"/>
+              </w:rPr>
+              <w:t>22 August 2026</w:t>
+            </w:r>
+          </w:p>
+        </w:tc>
+        <w:tc>
+          <w:tcPr>
+            <w:tcW w:type="dxa" w:w="2160"/>
+          </w:tcPr>
+          <w:p>
+            <w:r/>
+            <w:r>
+              <w:rPr>
+                <w:sz w:val="19"/>
+              </w:rPr>
+              <w:t>Expanded to 48 concepts from six Articulate ebooks; strengthened performance analysis, prototyping, visual design, video, accessibility, interaction and multi-device lab evidence.</w:t>
+            </w:r>
+          </w:p>
+        </w:tc>
+        <w:tc>
+          <w:tcPr>
+            <w:tcW w:type="dxa" w:w="2160"/>
+          </w:tcPr>
+          <w:p>
+            <w:r/>
+            <w:r>
+              <w:rPr>
+                <w:sz w:val="19"/>
+              </w:rPr>
+              <w:t>Dr Alfred Ang</w:t>
+            </w:r>
+          </w:p>
+        </w:tc>
+      </w:tr>
     </w:tbl>
     <w:p>
       <w:r>
@@ -419,12 +477,212 @@
       </w:r>
     </w:p>
     <w:p>
-      <w:r>
-        <w:fldChar w:fldCharType="begin"/>
-        <w:instrText xml:space="preserve">TOC \o "1-3" \h \z \u</w:instrText>
-        <w:fldChar w:fldCharType="separate"/>
-        <w:t>Right-click and choose “Update Field”, or press F9, to build the table of contents.</w:t>
-        <w:fldChar w:fldCharType="end"/>
+      <w:pPr>
+        <w:tabs>
+          <w:tab w:pos="9072" w:val="right" w:leader="dot"/>
+        </w:tabs>
+        <w:spacing w:after="60"/>
+      </w:pPr>
+      <w:r>
+        <w:rPr>
+          <w:rFonts w:ascii="Arial" w:hAnsi="Arial"/>
+          <w:b/>
+          <w:color w:val="333333"/>
+          <w:sz w:val="22"/>
+        </w:rPr>
+        <w:t>Purpose and Use</w:t>
+        <w:tab/>
+        <w:t>4</w:t>
+      </w:r>
+    </w:p>
+    <w:p>
+      <w:pPr>
+        <w:tabs>
+          <w:tab w:pos="9072" w:val="right" w:leader="dot"/>
+        </w:tabs>
+        <w:spacing w:after="60"/>
+      </w:pPr>
+      <w:r>
+        <w:rPr>
+          <w:rFonts w:ascii="Arial" w:hAnsi="Arial"/>
+          <w:b/>
+          <w:color w:val="333333"/>
+          <w:sz w:val="22"/>
+        </w:rPr>
+        <w:t>Learning Outcomes</w:t>
+        <w:tab/>
+        <w:t>4</w:t>
+      </w:r>
+    </w:p>
+    <w:p>
+      <w:pPr>
+        <w:tabs>
+          <w:tab w:pos="9072" w:val="right" w:leader="dot"/>
+        </w:tabs>
+        <w:spacing w:after="60"/>
+      </w:pPr>
+      <w:r>
+        <w:rPr>
+          <w:rFonts w:ascii="Arial" w:hAnsi="Arial"/>
+          <w:b/>
+          <w:color w:val="333333"/>
+          <w:sz w:val="22"/>
+        </w:rPr>
+        <w:t>TSC Alignment</w:t>
+        <w:tab/>
+        <w:t>4</w:t>
+      </w:r>
+    </w:p>
+    <w:p>
+      <w:pPr>
+        <w:tabs>
+          <w:tab w:pos="9072" w:val="right" w:leader="dot"/>
+        </w:tabs>
+        <w:spacing w:after="60"/>
+      </w:pPr>
+      <w:r>
+        <w:rPr>
+          <w:rFonts w:ascii="Arial" w:hAnsi="Arial"/>
+          <w:b/>
+          <w:color w:val="333333"/>
+          <w:sz w:val="22"/>
+        </w:rPr>
+        <w:t>Core Professional Workflow</w:t>
+        <w:tab/>
+        <w:t>4</w:t>
+      </w:r>
+    </w:p>
+    <w:p>
+      <w:pPr>
+        <w:tabs>
+          <w:tab w:pos="9072" w:val="right" w:leader="dot"/>
+        </w:tabs>
+        <w:spacing w:after="60"/>
+      </w:pPr>
+      <w:r>
+        <w:rPr>
+          <w:rFonts w:ascii="Arial" w:hAnsi="Arial"/>
+          <w:b/>
+          <w:color w:val="333333"/>
+          <w:sz w:val="22"/>
+        </w:rPr>
+        <w:t>Topic 1 — Get Started on Articulate Storyline 360</w:t>
+        <w:tab/>
+        <w:t>5</w:t>
+      </w:r>
+    </w:p>
+    <w:p>
+      <w:pPr>
+        <w:tabs>
+          <w:tab w:pos="9072" w:val="right" w:leader="dot"/>
+        </w:tabs>
+        <w:spacing w:after="60"/>
+      </w:pPr>
+      <w:r>
+        <w:rPr>
+          <w:rFonts w:ascii="Arial" w:hAnsi="Arial"/>
+          <w:b/>
+          <w:color w:val="333333"/>
+          <w:sz w:val="22"/>
+        </w:rPr>
+        <w:t>Topic 2 — Working with Assets</w:t>
+        <w:tab/>
+        <w:t>12</w:t>
+      </w:r>
+    </w:p>
+    <w:p>
+      <w:pPr>
+        <w:tabs>
+          <w:tab w:pos="9072" w:val="right" w:leader="dot"/>
+        </w:tabs>
+        <w:spacing w:after="60"/>
+      </w:pPr>
+      <w:r>
+        <w:rPr>
+          <w:rFonts w:ascii="Arial" w:hAnsi="Arial"/>
+          <w:b/>
+          <w:color w:val="333333"/>
+          <w:sz w:val="22"/>
+        </w:rPr>
+        <w:t>Topic 3 — Interactivity</w:t>
+        <w:tab/>
+        <w:t>22</w:t>
+      </w:r>
+    </w:p>
+    <w:p>
+      <w:pPr>
+        <w:tabs>
+          <w:tab w:pos="9072" w:val="right" w:leader="dot"/>
+        </w:tabs>
+        <w:spacing w:after="60"/>
+      </w:pPr>
+      <w:r>
+        <w:rPr>
+          <w:rFonts w:ascii="Arial" w:hAnsi="Arial"/>
+          <w:b/>
+          <w:color w:val="333333"/>
+          <w:sz w:val="22"/>
+        </w:rPr>
+        <w:t>Topic 4 — Presentation, Review and Distribution</w:t>
+        <w:tab/>
+        <w:t>28</w:t>
+      </w:r>
+    </w:p>
+    <w:p>
+      <w:pPr>
+        <w:tabs>
+          <w:tab w:pos="9072" w:val="right" w:leader="dot"/>
+        </w:tabs>
+        <w:spacing w:after="60"/>
+      </w:pPr>
+      <w:r>
+        <w:rPr>
+          <w:rFonts w:ascii="Arial" w:hAnsi="Arial"/>
+          <w:b/>
+          <w:color w:val="333333"/>
+          <w:sz w:val="22"/>
+        </w:rPr>
+        <w:t>Intellectual Property, Privacy and Responsible AI</w:t>
+        <w:tab/>
+        <w:t>33</w:t>
+      </w:r>
+    </w:p>
+    <w:p>
+      <w:pPr>
+        <w:tabs>
+          <w:tab w:pos="9072" w:val="right" w:leader="dot"/>
+        </w:tabs>
+        <w:spacing w:after="60"/>
+      </w:pPr>
+      <w:r>
+        <w:rPr>
+          <w:rFonts w:ascii="Arial" w:hAnsi="Arial"/>
+          <w:b/>
+          <w:color w:val="333333"/>
+          <w:sz w:val="22"/>
+        </w:rPr>
+        <w:t>Publishing and Lifecycle Checklist</w:t>
+        <w:tab/>
+        <w:t>33</w:t>
+      </w:r>
+    </w:p>
+    <w:p>
+      <w:pPr>
+        <w:tabs>
+          <w:tab w:pos="9072" w:val="right" w:leader="dot"/>
+        </w:tabs>
+        <w:spacing w:after="60"/>
+      </w:pPr>
+      <w:r>
+        <w:rPr>
+          <w:rFonts w:ascii="Arial" w:hAnsi="Arial"/>
+          <w:b/>
+          <w:color w:val="333333"/>
+          <w:sz w:val="22"/>
+        </w:rPr>
+        <w:t>Source Register</w:t>
+        <w:tab/>
+        <w:t>34</w:t>
       </w:r>
     </w:p>
     <w:p>
@@ -981,7 +1239,7 @@
     </w:p>
     <w:p>
       <w:r>
-        <w:t>1. Clarify the business objective, learner audience, device, delivery channel and constraints.</w:t>
+        <w:t>1. Verify the performance gap, required learner behaviour, audience, device, delivery channel and success measure.</w:t>
       </w:r>
     </w:p>
     <w:p>
@@ -991,27 +1249,32 @@
     </w:p>
     <w:p>
       <w:r>
-        <w:t>3. Work locally from a versioned copy of the supplied BEGIN .story file and preserve the END reference.</w:t>
-      </w:r>
-    </w:p>
-    <w:p>
-      <w:r>
-        <w:t>4. Use reusable themes, layouts, named objects, layers, states, triggers and variables deliberately.</w:t>
-      </w:r>
-    </w:p>
-    <w:p>
-      <w:r>
-        <w:t>5. Check rights, provenance, alternative text, focus order, captions and keyboard operation as content is added.</w:t>
-      </w:r>
-    </w:p>
-    <w:p>
-      <w:r>
-        <w:t>6. Preview the slide, scene and project; test correct, incorrect, boundary, revisit and resume paths.</w:t>
-      </w:r>
-    </w:p>
-    <w:p>
-      <w:r>
-        <w:t>7. Publish only to the approved review/test target, verify runtime/tracking and retain the source plus evidence.</w:t>
+        <w:t>3. Prototype the riskiest screens and interactions; record review decisions before full production.</w:t>
+      </w:r>
+    </w:p>
+    <w:p>
+      <w:r>
+        <w:t>4. Work locally from a versioned copy of the supplied BEGIN .story file and preserve the END reference.</w:t>
+      </w:r>
+    </w:p>
+    <w:p>
+      <w:r>
+        <w:t>5. Use reusable themes, layouts, named objects, layers, states, triggers and variables deliberately.</w:t>
+      </w:r>
+    </w:p>
+    <w:p>
+      <w:r>
+        <w:t>6. Check visual grammar, rights, provenance, alternative text, focus order, captions, media equivalents and keyboard operation as content is added.</w:t>
+      </w:r>
+    </w:p>
+    <w:p>
+      <w:r>
+        <w:t>7. Preview the slide, scene and project; test correct, incorrect, boundary, revisit, resume and representative device paths.</w:t>
+      </w:r>
+    </w:p>
+    <w:p>
+      <w:r>
+        <w:t>8. Publish only to the approved review/test target, verify runtime/tracking and retain the source plus evidence.</w:t>
       </w:r>
     </w:p>
     <w:p>
@@ -1024,7 +1287,7 @@
     </w:p>
     <w:p>
       <w:r>
-        <w:t>Story purpose · storyboard · project model · interface · scenes · slides · layers · quizzes · media libraries</w:t>
+        <w:t>Performance gap · story purpose · storyboard · prototype · project model · interface · scenes · slides · layers · quizzes · media libraries</w:t>
       </w:r>
     </w:p>
     <w:p>
@@ -1094,12 +1357,12 @@
         <w:pStyle w:val="Heading2"/>
       </w:pPr>
       <w:r>
-        <w:t>Storyboard Architecture</w:t>
-      </w:r>
-    </w:p>
-    <w:p>
-      <w:r>
-        <w:t>A storyboard makes the course visible before production by mapping screens, narration, media, interactions, transitions, branching and evidence.</w:t>
+        <w:t>Performance Gap Before Course Design</w:t>
+      </w:r>
+    </w:p>
+    <w:p>
+      <w:r>
+        <w:t>Course design begins by separating a knowledge or skill gap from process, motivation, tooling or policy problems, then defining the observable performance and measurement strategy.</w:t>
       </w:r>
     </w:p>
     <w:p>
@@ -1110,7 +1373,7 @@
         <w:t xml:space="preserve">Best used for: </w:t>
       </w:r>
       <w:r>
-        <w:t>Stakeholder alignment, estimating effort, accessibility planning and preventing expensive rework.</w:t>
+        <w:t>Deciding whether e-learning is an appropriate response and translating a business need into learner actions.</w:t>
       </w:r>
     </w:p>
     <w:p>
@@ -1121,7 +1384,7 @@
         <w:t xml:space="preserve">Key controls: </w:t>
       </w:r>
       <w:r>
-        <w:t>Screen ID; purpose; on-screen copy; narration; asset; interaction; branch; accessibility; owner; status.</w:t>
+        <w:t>Stakeholders; current performance; desired performance; root cause; knowledge/skill evidence; objective; success metric.</w:t>
       </w:r>
     </w:p>
     <w:p>
@@ -1132,7 +1395,7 @@
         <w:t xml:space="preserve">Watch for: </w:t>
       </w:r>
       <w:r>
-        <w:t>Treating the storyboard as a static script or failing to show conditional paths and feedback.</w:t>
+        <w:t>Starting with a feature list, accepting one stakeholder's opinion as the whole diagnosis or promising change that training cannot cause.</w:t>
       </w:r>
     </w:p>
     <w:p>
@@ -1143,7 +1406,121 @@
         <w:t xml:space="preserve">Quality evidence: </w:t>
       </w:r>
       <w:r>
+        <w:t>The brief states the verified gap, the required learner behaviour and how success will be measured.</w:t>
+      </w:r>
+    </w:p>
+    <w:p>
+      <w:pPr>
+        <w:pStyle w:val="Heading2"/>
+      </w:pPr>
+      <w:r>
+        <w:t>Storyboard Architecture</w:t>
+      </w:r>
+    </w:p>
+    <w:p>
+      <w:r>
+        <w:t>A storyboard makes the course visible before production by mapping screens, narration, media, interactions, transitions, branching and evidence.</w:t>
+      </w:r>
+    </w:p>
+    <w:p>
+      <w:r>
+        <w:rPr>
+          <w:b/>
+        </w:rPr>
+        <w:t xml:space="preserve">Best used for: </w:t>
+      </w:r>
+      <w:r>
+        <w:t>Stakeholder alignment, estimating effort, accessibility planning and preventing expensive rework.</w:t>
+      </w:r>
+    </w:p>
+    <w:p>
+      <w:r>
+        <w:rPr>
+          <w:b/>
+        </w:rPr>
+        <w:t xml:space="preserve">Key controls: </w:t>
+      </w:r>
+      <w:r>
+        <w:t>Screen ID; purpose; on-screen copy; narration; asset; interaction; branch; accessibility; owner; status.</w:t>
+      </w:r>
+    </w:p>
+    <w:p>
+      <w:r>
+        <w:rPr>
+          <w:b/>
+        </w:rPr>
+        <w:t xml:space="preserve">Watch for: </w:t>
+      </w:r>
+      <w:r>
+        <w:t>Treating the storyboard as a static script or failing to show conditional paths and feedback.</w:t>
+      </w:r>
+    </w:p>
+    <w:p>
+      <w:r>
+        <w:rPr>
+          <w:b/>
+        </w:rPr>
+        <w:t xml:space="preserve">Quality evidence: </w:t>
+      </w:r>
+      <w:r>
         <w:t>Every screen has a purpose, every branch reconnects or terminates deliberately, and every asset has an owner.</w:t>
+      </w:r>
+    </w:p>
+    <w:p>
+      <w:pPr>
+        <w:pStyle w:val="Heading2"/>
+      </w:pPr>
+      <w:r>
+        <w:t>Prototype-to-Release Feedback Loop</w:t>
+      </w:r>
+    </w:p>
+    <w:p>
+      <w:r>
+        <w:t>A small digital prototype makes navigation, visual treatment and interaction tangible before full production; alpha, beta and final releases then narrow the scope of change.</w:t>
+      </w:r>
+    </w:p>
+    <w:p>
+      <w:r>
+        <w:rPr>
+          <w:b/>
+        </w:rPr>
+        <w:t xml:space="preserve">Best used for: </w:t>
+      </w:r>
+      <w:r>
+        <w:t>Surfacing hidden requirements, validating risky interactions and controlling stakeholder feedback.</w:t>
+      </w:r>
+    </w:p>
+    <w:p>
+      <w:r>
+        <w:rPr>
+          <w:b/>
+        </w:rPr>
+        <w:t xml:space="preserve">Key controls: </w:t>
+      </w:r>
+      <w:r>
+        <w:t>Concept approval; prototype scope; review questions; alpha completeness; beta target test; defect threshold; final sign-off.</w:t>
+      </w:r>
+    </w:p>
+    <w:p>
+      <w:r>
+        <w:rPr>
+          <w:b/>
+        </w:rPr>
+        <w:t xml:space="preserve">Watch for: </w:t>
+      </w:r>
+      <w:r>
+        <w:t>Building the whole course before testing the live design, mixing preference feedback with defects or making major structural changes during beta.</w:t>
+      </w:r>
+    </w:p>
+    <w:p>
+      <w:r>
+        <w:rPr>
+          <w:b/>
+        </w:rPr>
+        <w:t xml:space="preserve">Quality evidence: </w:t>
+      </w:r>
+      <w:r>
+        <w:t>Each review stage has a defined purpose, owner, decision record and traceable source version.</w:t>
       </w:r>
     </w:p>
     <w:p>
@@ -1712,7 +2089,7 @@
     </w:p>
     <w:p>
       <w:r>
-        <w:t>5. Apply a coherent font and colour theme that supports projection contrast and the course audience.</w:t>
+        <w:t>5. Apply a coherent font and colour theme; use repetition, alignment and balance to establish a predictable visual system.</w:t>
       </w:r>
     </w:p>
     <w:p>
@@ -1722,17 +2099,22 @@
     </w:p>
     <w:p>
       <w:r>
-        <w:t>7. Preview the full scene and confirm the Begin control and navigation still work.</w:t>
-      </w:r>
-    </w:p>
-    <w:p>
-      <w:r>
-        <w:t>8. Compare your result against `03_01_END.story`; note one deliberate difference and why it improves the brief.</w:t>
-      </w:r>
-    </w:p>
-    <w:p>
-      <w:r>
-        <w:t>9. Save as `Lab-01-YourName.story` in this lab folder.</w:t>
+        <w:t>7. Review the slides in grayscale and at delivery size to confirm hierarchy and meaning do not depend on colour alone.</w:t>
+      </w:r>
+    </w:p>
+    <w:p>
+      <w:r>
+        <w:t>8. Preview the full scene and confirm the Begin control and navigation still work.</w:t>
+      </w:r>
+    </w:p>
+    <w:p>
+      <w:r>
+        <w:t>9. Compare your result against `03_01_END.story`; note one deliberate difference and why it improves the brief.</w:t>
+      </w:r>
+    </w:p>
+    <w:p>
+      <w:r>
+        <w:t>10. Save as `Lab-01-YourName.story` in this lab folder.</w:t>
       </w:r>
     </w:p>
     <w:p>
@@ -1777,7 +2159,7 @@
         <w:pStyle w:val="ListBullet"/>
       </w:pPr>
       <w:r>
-        <w:t>Theme choices are consistent and meet contrast requirements.</w:t>
+        <w:t>Theme choices demonstrate contrast, repetition, alignment and balance.</w:t>
       </w:r>
     </w:p>
     <w:p>
@@ -1785,7 +2167,7 @@
         <w:pStyle w:val="ListBullet"/>
       </w:pPr>
       <w:r>
-        <w:t>Navigation and preview behave as before.</w:t>
+        <w:t>Hierarchy remains clear in grayscale and navigation behaves as before.</w:t>
       </w:r>
     </w:p>
     <w:p>
@@ -1899,37 +2281,47 @@
     </w:p>
     <w:p>
       <w:r>
-        <w:t>3. Write concise learner-facing descriptions for campsite selection, campfire safety and essential toiletries.</w:t>
-      </w:r>
-    </w:p>
-    <w:p>
-      <w:r>
-        <w:t>4. Import or replace the supplied supporting pictures through the Media Library so assets remain traceable.</w:t>
-      </w:r>
-    </w:p>
-    <w:p>
-      <w:r>
-        <w:t>5. Use slide titles, hierarchy, alignment and spacing to make the intended reading order obvious.</w:t>
-      </w:r>
-    </w:p>
-    <w:p>
-      <w:r>
-        <w:t>6. Add meaningful alternative text; remove decorative objects from the focus order where appropriate.</w:t>
-      </w:r>
-    </w:p>
-    <w:p>
-      <w:r>
-        <w:t>7. Preview each slide at Fit and 100% zoom and test keyboard focus order.</w:t>
-      </w:r>
-    </w:p>
-    <w:p>
-      <w:r>
-        <w:t>8. Compare against `03_02_END.story` and record how the storyboard maps to the final slide content.</w:t>
-      </w:r>
-    </w:p>
-    <w:p>
-      <w:r>
-        <w:t>9. Save the completed working file and evidence screenshots.</w:t>
+        <w:t>3. State the performance gap, required learner action and one measure that would show improvement.</w:t>
+      </w:r>
+    </w:p>
+    <w:p>
+      <w:r>
+        <w:t>4. Write concise learner-facing descriptions for campsite selection, campfire safety and essential toiletries.</w:t>
+      </w:r>
+    </w:p>
+    <w:p>
+      <w:r>
+        <w:t>5. Import or replace the supplied supporting pictures through the Media Library so assets remain traceable.</w:t>
+      </w:r>
+    </w:p>
+    <w:p>
+      <w:r>
+        <w:t>6. Use slide titles, hierarchy, alignment and spacing to make the intended reading order obvious.</w:t>
+      </w:r>
+    </w:p>
+    <w:p>
+      <w:r>
+        <w:t>7. Add meaningful alternative text; remove decorative objects from the focus order where appropriate.</w:t>
+      </w:r>
+    </w:p>
+    <w:p>
+      <w:r>
+        <w:t>8. Preview each slide at Fit and 100% zoom and test keyboard focus order.</w:t>
+      </w:r>
+    </w:p>
+    <w:p>
+      <w:r>
+        <w:t>9. Treat the three-slide build as a prototype: ask one reviewer to test the live navigation and record accept/adapt/reject decisions.</w:t>
+      </w:r>
+    </w:p>
+    <w:p>
+      <w:r>
+        <w:t>10. Compare against `03_02_END.story` and record how the storyboard maps to the prototype content.</w:t>
+      </w:r>
+    </w:p>
+    <w:p>
+      <w:r>
+        <w:t>11. Save the completed working file and evidence screenshots.</w:t>
       </w:r>
     </w:p>
     <w:p>
@@ -1958,6 +2350,14 @@
         <w:pStyle w:val="ListBullet"/>
       </w:pPr>
       <w:r>
+        <w:t>The performance gap, learner action and success measure are explicit.</w:t>
+      </w:r>
+    </w:p>
+    <w:p>
+      <w:pPr>
+        <w:pStyle w:val="ListBullet"/>
+      </w:pPr>
+      <w:r>
         <w:t>Each slide has one clear purpose and concise copy.</w:t>
       </w:r>
     </w:p>
@@ -1966,7 +2366,7 @@
         <w:pStyle w:val="ListBullet"/>
       </w:pPr>
       <w:r>
-        <w:t>The three descriptions and visuals match the intended module topics.</w:t>
+        <w:t>Focus order and alternative text support meaningful navigation.</w:t>
       </w:r>
     </w:p>
     <w:p>
@@ -1974,15 +2374,7 @@
         <w:pStyle w:val="ListBullet"/>
       </w:pPr>
       <w:r>
-        <w:t>Focus order and alternative text support meaningful navigation.</w:t>
-      </w:r>
-    </w:p>
-    <w:p>
-      <w:pPr>
-        <w:pStyle w:val="ListBullet"/>
-      </w:pPr>
-      <w:r>
-        <w:t>The project previews without missing media.</w:t>
+        <w:t>Reviewer decisions and the resulting prototype revision are traceable.</w:t>
       </w:r>
     </w:p>
     <w:p>
@@ -2006,7 +2398,7 @@
     </w:p>
     <w:p>
       <w:r>
-        <w:t>Pictures · 360° media · video · audio · captions · accessibility · web content · screen recordings · text and layout</w:t>
+        <w:t>Visual grammar · pictures · 360° media · video · audio · captions · accessible equivalents · web content · screen recordings · layout</w:t>
       </w:r>
     </w:p>
     <w:p>
@@ -2076,12 +2468,12 @@
         <w:pStyle w:val="Heading2"/>
       </w:pPr>
       <w:r>
-        <w:t>Pictures and Visual Hierarchy</w:t>
-      </w:r>
-    </w:p>
-    <w:p>
-      <w:r>
-        <w:t>Pictures carry meaning when crop, contrast, focal point and proximity support the message.</w:t>
+        <w:t>Visual Design Grammar</w:t>
+      </w:r>
+    </w:p>
+    <w:p>
+      <w:r>
+        <w:t>Colour, contrast, repetition, alignment and balance create hierarchy and unity so learners can recognise what matters and how screens relate.</w:t>
       </w:r>
     </w:p>
     <w:p>
@@ -2092,7 +2484,7 @@
         <w:t xml:space="preserve">Best used for: </w:t>
       </w:r>
       <w:r>
-        <w:t>Context-setting, demonstrations, comparison and emotional framing.</w:t>
+        <w:t>Establishing a coherent theme, reusable component set and predictable reading path.</w:t>
       </w:r>
     </w:p>
     <w:p>
@@ -2103,7 +2495,7 @@
         <w:t xml:space="preserve">Key controls: </w:t>
       </w:r>
       <w:r>
-        <w:t>Crop; size; position; transparency; recolour; alt text; compression; replace picture.</w:t>
+        <w:t>Purposeful palette; strong contrast; repeated typography and shapes; grid alignment; visual weight; consistent image style.</w:t>
       </w:r>
     </w:p>
     <w:p>
@@ -2114,7 +2506,7 @@
         <w:t xml:space="preserve">Watch for: </w:t>
       </w:r>
       <w:r>
-        <w:t>Low-resolution sources, decorative clutter, stretched images or text placed over busy detail.</w:t>
+        <w:t>Near-matches that look accidental, too many competing styles, colour-only meaning or balancing decoration instead of instructional emphasis.</w:t>
       </w:r>
     </w:p>
     <w:p>
@@ -2125,7 +2517,7 @@
         <w:t xml:space="preserve">Quality evidence: </w:t>
       </w:r>
       <w:r>
-        <w:t>The focal point survives projection and mobile viewing, and the image has appropriate alternative text.</w:t>
+        <w:t>A grayscale and alignment review still reveals hierarchy, grouping and intended emphasis across representative screens.</w:t>
       </w:r>
     </w:p>
     <w:p>
@@ -2133,12 +2525,12 @@
         <w:pStyle w:val="Heading2"/>
       </w:pPr>
       <w:r>
-        <w:t>360° Images, Markers and Hotspots</w:t>
-      </w:r>
-    </w:p>
-    <w:p>
-      <w:r>
-        <w:t>A 360° image creates an explorable environment; markers present information and hotspots define interactive regions.</w:t>
+        <w:t>Pictures and Visual Hierarchy</w:t>
+      </w:r>
+    </w:p>
+    <w:p>
+      <w:r>
+        <w:t>Pictures carry meaning when crop, contrast, focal point and proximity support the message.</w:t>
       </w:r>
     </w:p>
     <w:p>
@@ -2149,7 +2541,7 @@
         <w:t xml:space="preserve">Best used for: </w:t>
       </w:r>
       <w:r>
-        <w:t>Virtual tours, safety inspections, product familiarisation and spatial decisions.</w:t>
+        <w:t>Context-setting, demonstrations, comparison and emotional framing.</w:t>
       </w:r>
     </w:p>
     <w:p>
@@ -2160,7 +2552,7 @@
         <w:t xml:space="preserve">Key controls: </w:t>
       </w:r>
       <w:r>
-        <w:t>Initial view; marker; hotspot; label; media; navigation; accessibility; completion rule.</w:t>
+        <w:t>Crop; size; position; transparency; recolour; alt text; compression; replace picture.</w:t>
       </w:r>
     </w:p>
     <w:p>
@@ -2171,7 +2563,7 @@
         <w:t xml:space="preserve">Watch for: </w:t>
       </w:r>
       <w:r>
-        <w:t>Hidden required targets, motion discomfort, inaccessible hotspots or no cue that the scene is interactive.</w:t>
+        <w:t>Low-resolution sources, decorative clutter, stretched images or text placed over busy detail.</w:t>
       </w:r>
     </w:p>
     <w:p>
@@ -2182,7 +2574,7 @@
         <w:t xml:space="preserve">Quality evidence: </w:t>
       </w:r>
       <w:r>
-        <w:t>Keyboard and pointer tests reach every required target and the learner knows when exploration is complete.</w:t>
+        <w:t>The focal point survives projection and mobile viewing, and the image has appropriate alternative text.</w:t>
       </w:r>
     </w:p>
     <w:p>
@@ -2190,12 +2582,12 @@
         <w:pStyle w:val="Heading2"/>
       </w:pPr>
       <w:r>
-        <w:t>Video as Demonstration Evidence</w:t>
-      </w:r>
-    </w:p>
-    <w:p>
-      <w:r>
-        <w:t>Video shows change over time but requires deliberate pacing, controls, compression and an accessible alternative.</w:t>
+        <w:t>360° Images, Markers and Hotspots</w:t>
+      </w:r>
+    </w:p>
+    <w:p>
+      <w:r>
+        <w:t>A 360° image creates an explorable environment; markers present information and hotspots define interactive regions.</w:t>
       </w:r>
     </w:p>
     <w:p>
@@ -2206,7 +2598,7 @@
         <w:t xml:space="preserve">Best used for: </w:t>
       </w:r>
       <w:r>
-        <w:t>Procedural demonstrations, expert messages and behaviour modelling.</w:t>
+        <w:t>Virtual tours, safety inspections, product familiarisation and spatial decisions.</w:t>
       </w:r>
     </w:p>
     <w:p>
@@ -2217,7 +2609,7 @@
         <w:t xml:space="preserve">Key controls: </w:t>
       </w:r>
       <w:r>
-        <w:t>Insert/website video; trim; poster frame; playback; controls; captions; transcript; quality.</w:t>
+        <w:t>Initial view; marker; hotspot; label; media; navigation; accessibility; completion rule.</w:t>
       </w:r>
     </w:p>
     <w:p>
@@ -2228,7 +2620,7 @@
         <w:t xml:space="preserve">Watch for: </w:t>
       </w:r>
       <w:r>
-        <w:t>Autoplay with sound, unreadable screen detail, missing captions or interaction placed over video controls.</w:t>
+        <w:t>Hidden required targets, motion discomfort, inaccessible hotspots or no cue that the scene is interactive.</w:t>
       </w:r>
     </w:p>
     <w:p>
@@ -2239,7 +2631,7 @@
         <w:t xml:space="preserve">Quality evidence: </w:t>
       </w:r>
       <w:r>
-        <w:t>Playback works in the publish target and captions/transcript convey equivalent information.</w:t>
+        <w:t>Keyboard and pointer tests reach every required target and the learner knows when exploration is complete.</w:t>
       </w:r>
     </w:p>
     <w:p>
@@ -2247,12 +2639,12 @@
         <w:pStyle w:val="Heading2"/>
       </w:pPr>
       <w:r>
-        <w:t>Audio, Narration and Closed Captions</w:t>
-      </w:r>
-    </w:p>
-    <w:p>
-      <w:r>
-        <w:t>Narration can guide attention while captions expose speech and meaningful sound to learners who cannot hear it.</w:t>
+        <w:t>Video as Demonstration Evidence</w:t>
+      </w:r>
+    </w:p>
+    <w:p>
+      <w:r>
+        <w:t>Video shows change over time but requires deliberate pacing, controls, compression and an accessible alternative.</w:t>
       </w:r>
     </w:p>
     <w:p>
@@ -2263,7 +2655,7 @@
         <w:t xml:space="preserve">Best used for: </w:t>
       </w:r>
       <w:r>
-        <w:t>Story-led modules, demonstrations and multilingual or noisy environments.</w:t>
+        <w:t>Procedural demonstrations, expert messages and behaviour modelling.</w:t>
       </w:r>
     </w:p>
     <w:p>
@@ -2274,7 +2666,7 @@
         <w:t xml:space="preserve">Key controls: </w:t>
       </w:r>
       <w:r>
-        <w:t>Record/import; waveform; trim; fade; volume; VTT captions; caption button; transcript.</w:t>
+        <w:t>Insert/website video; trim; poster frame; playback; controls; captions; transcript; quality.</w:t>
       </w:r>
     </w:p>
     <w:p>
@@ -2285,7 +2677,7 @@
         <w:t xml:space="preserve">Watch for: </w:t>
       </w:r>
       <w:r>
-        <w:t>Narration duplicating every on-screen word, inconsistent levels, timing drift or captions covering controls.</w:t>
+        <w:t>Autoplay with sound, unreadable screen detail, missing captions or interaction placed over video controls.</w:t>
       </w:r>
     </w:p>
     <w:p>
@@ -2296,7 +2688,178 @@
         <w:t xml:space="preserve">Quality evidence: </w:t>
       </w:r>
       <w:r>
+        <w:t>Playback works in the publish target and captions/transcript convey equivalent information.</w:t>
+      </w:r>
+    </w:p>
+    <w:p>
+      <w:pPr>
+        <w:pStyle w:val="Heading2"/>
+      </w:pPr>
+      <w:r>
+        <w:t>Video and Screencast Production Workflow</w:t>
+      </w:r>
+    </w:p>
+    <w:p>
+      <w:r>
+        <w:t>Clear audio, a controlled recording environment, a concise outline and a rehearsed screen path improve instructional video more than expensive equipment alone.</w:t>
+      </w:r>
+    </w:p>
+    <w:p>
+      <w:r>
+        <w:rPr>
+          <w:b/>
+        </w:rPr>
+        <w:t xml:space="preserve">Best used for: </w:t>
+      </w:r>
+      <w:r>
+        <w:t>Talking-head introductions, software demonstrations and short worked examples.</w:t>
+      </w:r>
+    </w:p>
+    <w:p>
+      <w:r>
+        <w:rPr>
+          <w:b/>
+        </w:rPr>
+        <w:t xml:space="preserve">Key controls: </w:t>
+      </w:r>
+      <w:r>
+        <w:t>External microphone; noise/echo check; lighting; stable camera; outline; recording window; prepared files; dry run; edit points.</w:t>
+      </w:r>
+    </w:p>
+    <w:p>
+      <w:r>
+        <w:rPr>
+          <w:b/>
+        </w:rPr>
+        <w:t xml:space="preserve">Watch for: </w:t>
+      </w:r>
+      <w:r>
+        <w:t>Relying on camera quality while ignoring sound, improvising a long script, exposing notifications or searching for files during capture.</w:t>
+      </w:r>
+    </w:p>
+    <w:p>
+      <w:r>
+        <w:rPr>
+          <w:b/>
+        </w:rPr>
+        <w:t xml:space="preserve">Quality evidence: </w:t>
+      </w:r>
+      <w:r>
+        <w:t>A test recording is intelligible, visually stable and follows a rehearsed path with no private or distracting content.</w:t>
+      </w:r>
+    </w:p>
+    <w:p>
+      <w:pPr>
+        <w:pStyle w:val="Heading2"/>
+      </w:pPr>
+      <w:r>
+        <w:t>Audio, Narration and Closed Captions</w:t>
+      </w:r>
+    </w:p>
+    <w:p>
+      <w:r>
+        <w:t>Narration can guide attention while captions expose speech and meaningful sound to learners who cannot hear it.</w:t>
+      </w:r>
+    </w:p>
+    <w:p>
+      <w:r>
+        <w:rPr>
+          <w:b/>
+        </w:rPr>
+        <w:t xml:space="preserve">Best used for: </w:t>
+      </w:r>
+      <w:r>
+        <w:t>Story-led modules, demonstrations and multilingual or noisy environments.</w:t>
+      </w:r>
+    </w:p>
+    <w:p>
+      <w:r>
+        <w:rPr>
+          <w:b/>
+        </w:rPr>
+        <w:t xml:space="preserve">Key controls: </w:t>
+      </w:r>
+      <w:r>
+        <w:t>Record/import; waveform; trim; fade; volume; VTT captions; caption button; transcript.</w:t>
+      </w:r>
+    </w:p>
+    <w:p>
+      <w:r>
+        <w:rPr>
+          <w:b/>
+        </w:rPr>
+        <w:t xml:space="preserve">Watch for: </w:t>
+      </w:r>
+      <w:r>
+        <w:t>Narration duplicating every on-screen word, inconsistent levels, timing drift or captions covering controls.</w:t>
+      </w:r>
+    </w:p>
+    <w:p>
+      <w:r>
+        <w:rPr>
+          <w:b/>
+        </w:rPr>
+        <w:t xml:space="preserve">Quality evidence: </w:t>
+      </w:r>
+      <w:r>
         <w:t>Audio is intelligible, synchronised and optional; captions are accurate and available in the player.</w:t>
+      </w:r>
+    </w:p>
+    <w:p>
+      <w:pPr>
+        <w:pStyle w:val="Heading2"/>
+      </w:pPr>
+      <w:r>
+        <w:t>Accessible Media Equivalence</w:t>
+      </w:r>
+    </w:p>
+    <w:p>
+      <w:r>
+        <w:t>Accessible media provides equivalent meaning through captions, transcripts, descriptive narration or an accessible job aid, while keeping playback under learner control.</w:t>
+      </w:r>
+    </w:p>
+    <w:p>
+      <w:r>
+        <w:rPr>
+          <w:b/>
+        </w:rPr>
+        <w:t xml:space="preserve">Best used for: </w:t>
+      </w:r>
+      <w:r>
+        <w:t>Audio, talking-head video, demonstrations and software training used by learners with hearing, vision or mobility limitations.</w:t>
+      </w:r>
+    </w:p>
+    <w:p>
+      <w:r>
+        <w:rPr>
+          <w:b/>
+        </w:rPr>
+        <w:t xml:space="preserve">Key controls: </w:t>
+      </w:r>
+      <w:r>
+        <w:t>Speaker identification; meaningful sound; visual-action description; transcript; step-based job aid; pause/seek; keyboard path; non-autoplay.</w:t>
+      </w:r>
+    </w:p>
+    <w:p>
+      <w:r>
+        <w:rPr>
+          <w:b/>
+        </w:rPr>
+        <w:t xml:space="preserve">Watch for: </w:t>
+      </w:r>
+      <w:r>
+        <w:t>A verbatim transcript that omits visual actions, captions without meaningful sound, forced autoplay or requiring learners to self-identify before receiving an equivalent.</w:t>
+      </w:r>
+    </w:p>
+    <w:p>
+      <w:r>
+        <w:rPr>
+          <w:b/>
+        </w:rPr>
+        <w:t xml:space="preserve">Quality evidence: </w:t>
+      </w:r>
+      <w:r>
+        <w:t>A learner can obtain the same instructional meaning and complete the task without depending on sight, hearing or precise pointer control.</w:t>
       </w:r>
     </w:p>
     <w:p>
@@ -3078,37 +3641,52 @@
     </w:p>
     <w:p>
       <w:r>
-        <w:t>3. Import or record narration on the intended slide and inspect the waveform.</w:t>
-      </w:r>
-    </w:p>
-    <w:p>
-      <w:r>
-        <w:t>4. Trim silence, normalise perceived level and add short fades where needed.</w:t>
-      </w:r>
-    </w:p>
-    <w:p>
-      <w:r>
-        <w:t>5. Import or create the supplied VTT captions and correct timing and wording.</w:t>
-      </w:r>
-    </w:p>
-    <w:p>
-      <w:r>
-        <w:t>6. Confirm the player exposes captions and that keyboard users can operate the control.</w:t>
-      </w:r>
-    </w:p>
-    <w:p>
-      <w:r>
-        <w:t>7. Align object timing to narration using the playhead or cue points where appropriate.</w:t>
-      </w:r>
-    </w:p>
-    <w:p>
-      <w:r>
-        <w:t>8. Preview with audio on, audio muted and captions on; check that captions do not cover essential content.</w:t>
-      </w:r>
-    </w:p>
-    <w:p>
-      <w:r>
-        <w:t>9. Compare with `05_01_END.story` and save the completed .story file and evidence.</w:t>
+        <w:t>3. Prepare the recording space: silence notifications and noise sources, avoid echo, position the microphone and run a short level test.</w:t>
+      </w:r>
+    </w:p>
+    <w:p>
+      <w:r>
+        <w:t>4. Rehearse the complete screen path with every application and source file open at the intended recording size.</w:t>
+      </w:r>
+    </w:p>
+    <w:p>
+      <w:r>
+        <w:t>5. Import or record narration on the intended slide and inspect the waveform.</w:t>
+      </w:r>
+    </w:p>
+    <w:p>
+      <w:r>
+        <w:t>6. Trim silence, normalise perceived level and add short fades where needed.</w:t>
+      </w:r>
+    </w:p>
+    <w:p>
+      <w:r>
+        <w:t>7. Import or create the supplied VTT captions and correct timing, wording, speaker identification and meaningful sound cues.</w:t>
+      </w:r>
+    </w:p>
+    <w:p>
+      <w:r>
+        <w:t>8. Provide a transcript or accessible step-based equivalent that also explains instructional actions shown only on screen.</w:t>
+      </w:r>
+    </w:p>
+    <w:p>
+      <w:r>
+        <w:t>9. Confirm the player exposes captions and that keyboard users can operate the control.</w:t>
+      </w:r>
+    </w:p>
+    <w:p>
+      <w:r>
+        <w:t>10. Align object timing to narration using the playhead or cue points where appropriate.</w:t>
+      </w:r>
+    </w:p>
+    <w:p>
+      <w:r>
+        <w:t>11. Preview with audio on, audio muted and captions on; check that captions do not cover essential content.</w:t>
+      </w:r>
+    </w:p>
+    <w:p>
+      <w:r>
+        <w:t>12. Compare with `05_01_END.story` and save the completed .story file and evidence.</w:t>
       </w:r>
     </w:p>
     <w:p>
@@ -3137,7 +3715,7 @@
         <w:pStyle w:val="ListBullet"/>
       </w:pPr>
       <w:r>
-        <w:t>Narration is intelligible and synchronised.</w:t>
+        <w:t>Narration is intelligible, synchronised and free of avoidable recording distractions.</w:t>
       </w:r>
     </w:p>
     <w:p>
@@ -3145,7 +3723,7 @@
         <w:pStyle w:val="ListBullet"/>
       </w:pPr>
       <w:r>
-        <w:t>Captions accurately represent speech and meaningful sound.</w:t>
+        <w:t>Captions accurately represent speech, speakers and meaningful sound.</w:t>
       </w:r>
     </w:p>
     <w:p>
@@ -3153,7 +3731,7 @@
         <w:pStyle w:val="ListBullet"/>
       </w:pPr>
       <w:r>
-        <w:t>Captions are available through an operable control.</w:t>
+        <w:t>Playback is learner-controlled and an equivalent transcript/job aid covers visual actions.</w:t>
       </w:r>
     </w:p>
     <w:p>
@@ -3290,22 +3868,27 @@
     </w:p>
     <w:p>
       <w:r>
-        <w:t>6. Expose caption and volume controls consistently in the player.</w:t>
-      </w:r>
-    </w:p>
-    <w:p>
-      <w:r>
-        <w:t>7. Verify focus order, alternative text and accessible object visibility on every slide.</w:t>
-      </w:r>
-    </w:p>
-    <w:p>
-      <w:r>
-        <w:t>8. Preview the complete scene using normal navigation, replay and revisit; log any resume differences.</w:t>
-      </w:r>
-    </w:p>
-    <w:p>
-      <w:r>
-        <w:t>9. Compare with `05_02_END.story`, save the completed .story file and test matrix.</w:t>
+        <w:t>6. Expose caption, volume, pause and seek controls consistently in the player; do not force autoplay.</w:t>
+      </w:r>
+    </w:p>
+    <w:p>
+      <w:r>
+        <w:t>7. Attach or link an accessible transcript that includes relevant visual-action descriptions.</w:t>
+      </w:r>
+    </w:p>
+    <w:p>
+      <w:r>
+        <w:t>8. Verify focus order, alternative text and accessible object visibility on every slide.</w:t>
+      </w:r>
+    </w:p>
+    <w:p>
+      <w:r>
+        <w:t>9. Preview the complete scene using normal navigation, replay and revisit; log any resume differences.</w:t>
+      </w:r>
+    </w:p>
+    <w:p>
+      <w:r>
+        <w:t>10. Compare with `05_02_END.story`, save the completed .story file and test matrix.</w:t>
       </w:r>
     </w:p>
     <w:p>
@@ -3334,7 +3917,7 @@
         <w:pStyle w:val="ListBullet"/>
       </w:pPr>
       <w:r>
-        <w:t>All audio and captions map to the correct slides.</w:t>
+        <w:t>All audio, captions and transcript equivalents map to the correct slides.</w:t>
       </w:r>
     </w:p>
     <w:p>
@@ -3342,7 +3925,7 @@
         <w:pStyle w:val="ListBullet"/>
       </w:pPr>
       <w:r>
-        <w:t>Naming and control behaviour are consistent.</w:t>
+        <w:t>Naming and learner-controlled playback behaviour are consistent.</w:t>
       </w:r>
     </w:p>
     <w:p>
@@ -3358,7 +3941,7 @@
         <w:pStyle w:val="ListBullet"/>
       </w:pPr>
       <w:r>
-        <w:t>Keyboard and caption checks pass on every slide.</w:t>
+        <w:t>Keyboard, focus and caption checks pass on every slide.</w:t>
       </w:r>
     </w:p>
     <w:p>
@@ -3382,7 +3965,7 @@
     </w:p>
     <w:p>
       <w:r>
-        <w:t>Zoom regions · interactive objects · triggers · states · variables · timeline · branching · feedback · motion</w:t>
+        <w:t>Meaningful choice · learner-controlled discovery · triggers · states · variables · timeline · branching · feedback · motion</w:t>
       </w:r>
     </w:p>
     <w:p>
@@ -3509,12 +4092,12 @@
         <w:pStyle w:val="Heading2"/>
       </w:pPr>
       <w:r>
-        <w:t>Trigger Anatomy and Execution Order</w:t>
-      </w:r>
-    </w:p>
-    <w:p>
-      <w:r>
-        <w:t>A trigger performs an action on an object or variable when an event occurs, optionally under conditions.</w:t>
+        <w:t>Meaningful Choice, Consequence and Feedback</w:t>
+      </w:r>
+    </w:p>
+    <w:p>
+      <w:r>
+        <w:t>An interaction earns its place when a realistic learner decision changes what happens next and feedback explains the consequence in context.</w:t>
       </w:r>
     </w:p>
     <w:p>
@@ -3525,7 +4108,7 @@
         <w:t xml:space="preserve">Best used for: </w:t>
       </w:r>
       <w:r>
-        <w:t>Navigation, layer control, state changes, media control, scoring and custom logic.</w:t>
+        <w:t>Scenario practice, judgement calls, objection handling and safe rehearsal of high-risk decisions.</w:t>
       </w:r>
     </w:p>
     <w:p>
@@ -3536,7 +4119,7 @@
         <w:t xml:space="preserve">Key controls: </w:t>
       </w:r>
       <w:r>
-        <w:t>Action; target; event; object; condition; order; scope; copied trigger.</w:t>
+        <w:t>Relevant prompt; plausible options; decision point; immediate consequence; explanatory feedback; retry/reflection; objective alignment.</w:t>
       </w:r>
     </w:p>
     <w:p>
@@ -3547,7 +4130,7 @@
         <w:t xml:space="preserve">Watch for: </w:t>
       </w:r>
       <w:r>
-        <w:t>Correct triggers in the wrong order, triggers attached to covered objects or ambiguous next-slide targets.</w:t>
+        <w:t>Clicking for its own sake, trivia disconnected from work, cosmetic branches or feedback that only says correct/incorrect.</w:t>
       </w:r>
     </w:p>
     <w:p>
@@ -3558,7 +4141,7 @@
         <w:t xml:space="preserve">Quality evidence: </w:t>
       </w:r>
       <w:r>
-        <w:t>Trigger panel order matches the logic diagram and tests prove every condition path.</w:t>
+        <w:t>A reviewer can trace each interaction from objective to authentic decision, consequence and transferable feedback.</w:t>
       </w:r>
     </w:p>
     <w:p>
@@ -3566,12 +4149,12 @@
         <w:pStyle w:val="Heading2"/>
       </w:pPr>
       <w:r>
-        <w:t>Object States</w:t>
-      </w:r>
-    </w:p>
-    <w:p>
-      <w:r>
-        <w:t>States store visual versions of one object; built-in states may respond automatically while custom states need explicit logic.</w:t>
+        <w:t>Trigger Anatomy and Execution Order</w:t>
+      </w:r>
+    </w:p>
+    <w:p>
+      <w:r>
+        <w:t>A trigger performs an action on an object or variable when an event occurs, optionally under conditions.</w:t>
       </w:r>
     </w:p>
     <w:p>
@@ -3582,7 +4165,7 @@
         <w:t xml:space="preserve">Best used for: </w:t>
       </w:r>
       <w:r>
-        <w:t>Selection, progress, disabled controls, visited indicators and feedback.</w:t>
+        <w:t>Navigation, layer control, state changes, media control, scoring and custom logic.</w:t>
       </w:r>
     </w:p>
     <w:p>
@@ -3593,7 +4176,7 @@
         <w:t xml:space="preserve">Key controls: </w:t>
       </w:r>
       <w:r>
-        <w:t>Normal; hover; down; selected; visited; disabled; custom; initial state; edit states.</w:t>
+        <w:t>Action; target; event; object; condition; order; scope; copied trigger.</w:t>
       </w:r>
     </w:p>
     <w:p>
@@ -3604,7 +4187,7 @@
         <w:t xml:space="preserve">Watch for: </w:t>
       </w:r>
       <w:r>
-        <w:t>Duplicating objects instead of states, hiding critical meaning only in colour or leaving a disabled control focusable.</w:t>
+        <w:t>Correct triggers in the wrong order, triggers attached to covered objects or ambiguous next-slide targets.</w:t>
       </w:r>
     </w:p>
     <w:p>
@@ -3615,7 +4198,7 @@
         <w:t xml:space="preserve">Quality evidence: </w:t>
       </w:r>
       <w:r>
-        <w:t>State changes are predictable, perceivable and preserved appropriately on revisit.</w:t>
+        <w:t>Trigger panel order matches the logic diagram and tests prove every condition path.</w:t>
       </w:r>
     </w:p>
     <w:p>
@@ -3623,12 +4206,12 @@
         <w:pStyle w:val="Heading2"/>
       </w:pPr>
       <w:r>
-        <w:t>Variables and Conditional Logic</w:t>
-      </w:r>
-    </w:p>
-    <w:p>
-      <w:r>
-        <w:t>Text, number and true/false variables retain information that triggers can evaluate to personalise or control flow.</w:t>
+        <w:t>Object States</w:t>
+      </w:r>
+    </w:p>
+    <w:p>
+      <w:r>
+        <w:t>States store visual versions of one object; built-in states may respond automatically while custom states need explicit logic.</w:t>
       </w:r>
     </w:p>
     <w:p>
@@ -3639,7 +4222,7 @@
         <w:t xml:space="preserve">Best used for: </w:t>
       </w:r>
       <w:r>
-        <w:t>Progress gates, scores, names, branching, toggles and completion checks.</w:t>
+        <w:t>Selection, progress, disabled controls, visited indicators and feedback.</w:t>
       </w:r>
     </w:p>
     <w:p>
@@ -3650,7 +4233,7 @@
         <w:t xml:space="preserve">Key controls: </w:t>
       </w:r>
       <w:r>
-        <w:t>Variable type; default; adjust; reference; condition; operator; scope; reset.</w:t>
+        <w:t>Normal; hover; down; selected; visited; disabled; custom; initial state; edit states.</w:t>
       </w:r>
     </w:p>
     <w:p>
@@ -3661,7 +4244,7 @@
         <w:t xml:space="preserve">Watch for: </w:t>
       </w:r>
       <w:r>
-        <w:t>Type mismatch, stale values on retry, multiple variables representing one fact or conditions evaluated too early.</w:t>
+        <w:t>Duplicating objects instead of states, hiding critical meaning only in colour or leaving a disabled control focusable.</w:t>
       </w:r>
     </w:p>
     <w:p>
@@ -3672,7 +4255,7 @@
         <w:t xml:space="preserve">Quality evidence: </w:t>
       </w:r>
       <w:r>
-        <w:t>A test matrix proves default, boundary and reset cases and shows the variable value where needed.</w:t>
+        <w:t>State changes are predictable, perceivable and preserved appropriately on revisit.</w:t>
       </w:r>
     </w:p>
     <w:p>
@@ -3680,12 +4263,12 @@
         <w:pStyle w:val="Heading2"/>
       </w:pPr>
       <w:r>
-        <w:t>Timeline, Cue Points and Synchronisation</w:t>
-      </w:r>
-    </w:p>
-    <w:p>
-      <w:r>
-        <w:t>The timeline controls when objects and media appear; cue points provide named anchors for synchronised actions.</w:t>
+        <w:t>Variables and Conditional Logic</w:t>
+      </w:r>
+    </w:p>
+    <w:p>
+      <w:r>
+        <w:t>Text, number and true/false variables retain information that triggers can evaluate to personalise or control flow.</w:t>
       </w:r>
     </w:p>
     <w:p>
@@ -3696,7 +4279,7 @@
         <w:t xml:space="preserve">Best used for: </w:t>
       </w:r>
       <w:r>
-        <w:t>Narrated animation, timed reveals and media-coordinated interactions.</w:t>
+        <w:t>Progress gates, scores, names, branching, toggles and completion checks.</w:t>
       </w:r>
     </w:p>
     <w:p>
@@ -3707,7 +4290,7 @@
         <w:t xml:space="preserve">Key controls: </w:t>
       </w:r>
       <w:r>
-        <w:t>Start/end; show until end; align to playhead; cue point; lock; visibility; waveform.</w:t>
+        <w:t>Variable type; default; adjust; reference; condition; operator; scope; reset.</w:t>
       </w:r>
     </w:p>
     <w:p>
@@ -3718,7 +4301,7 @@
         <w:t xml:space="preserve">Watch for: </w:t>
       </w:r>
       <w:r>
-        <w:t>Objects ending too early, animation drift after audio edits or a locked timeline hiding the cause.</w:t>
+        <w:t>Type mismatch, stale values on retry, multiple variables representing one fact or conditions evaluated too early.</w:t>
       </w:r>
     </w:p>
     <w:p>
@@ -3729,7 +4312,7 @@
         <w:t xml:space="preserve">Quality evidence: </w:t>
       </w:r>
       <w:r>
-        <w:t>Playback remains synchronised after seeking, replay and common device performance variation.</w:t>
+        <w:t>A test matrix proves default, boundary and reset cases and shows the variable value where needed.</w:t>
       </w:r>
     </w:p>
     <w:p>
@@ -3737,12 +4320,12 @@
         <w:pStyle w:val="Heading2"/>
       </w:pPr>
       <w:r>
-        <w:t>Animations, Motion Paths and Transitions</w:t>
-      </w:r>
-    </w:p>
-    <w:p>
-      <w:r>
-        <w:t>Animations affect objects, motion paths move them, and transitions affect the change between slides.</w:t>
+        <w:t>Timeline, Cue Points and Synchronisation</w:t>
+      </w:r>
+    </w:p>
+    <w:p>
+      <w:r>
+        <w:t>The timeline controls when objects and media appear; cue points provide named anchors for synchronised actions.</w:t>
       </w:r>
     </w:p>
     <w:p>
@@ -3753,7 +4336,7 @@
         <w:t xml:space="preserve">Best used for: </w:t>
       </w:r>
       <w:r>
-        <w:t>Demonstrating sequence, change, direction and continuity.</w:t>
+        <w:t>Narrated animation, timed reveals and media-coordinated interactions.</w:t>
       </w:r>
     </w:p>
     <w:p>
@@ -3764,7 +4347,7 @@
         <w:t xml:space="preserve">Key controls: </w:t>
       </w:r>
       <w:r>
-        <w:t>Entrance/exit/emphasis; duration; delay; direction; path; orient to path; transition.</w:t>
+        <w:t>Start/end; show until end; align to playhead; cue point; lock; visibility; waveform.</w:t>
       </w:r>
     </w:p>
     <w:p>
@@ -3775,7 +4358,7 @@
         <w:t xml:space="preserve">Watch for: </w:t>
       </w:r>
       <w:r>
-        <w:t>Decorative motion, competing animations, motion-trigger mismatch or inaccessible information shown too briefly.</w:t>
+        <w:t>Objects ending too early, animation drift after audio edits or a locked timeline hiding the cause.</w:t>
       </w:r>
     </w:p>
     <w:p>
@@ -3786,7 +4369,7 @@
         <w:t xml:space="preserve">Quality evidence: </w:t>
       </w:r>
       <w:r>
-        <w:t>Motion clarifies one teaching point and the static slide still communicates the complete meaning.</w:t>
+        <w:t>Playback remains synchronised after seeking, replay and common device performance variation.</w:t>
       </w:r>
     </w:p>
     <w:p>
@@ -3794,12 +4377,12 @@
         <w:pStyle w:val="Heading2"/>
       </w:pPr>
       <w:r>
-        <w:t>Freeform Interactions and Question Conversion</w:t>
-      </w:r>
-    </w:p>
-    <w:p>
-      <w:r>
-        <w:t>Existing objects can become selectable, drag-and-drop, text-entry or hotspot responses with scoring and feedback.</w:t>
+        <w:t>Animations, Motion Paths and Transitions</w:t>
+      </w:r>
+    </w:p>
+    <w:p>
+      <w:r>
+        <w:t>Animations affect objects, motion paths move them, and transitions affect the change between slides.</w:t>
       </w:r>
     </w:p>
     <w:p>
@@ -3810,7 +4393,7 @@
         <w:t xml:space="preserve">Best used for: </w:t>
       </w:r>
       <w:r>
-        <w:t>Authentic decisions where standard question layouts are too restrictive.</w:t>
+        <w:t>Demonstrating sequence, change, direction and continuity.</w:t>
       </w:r>
     </w:p>
     <w:p>
@@ -3821,7 +4404,7 @@
         <w:t xml:space="preserve">Key controls: </w:t>
       </w:r>
       <w:r>
-        <w:t>Convert to freeform; response objects; drop targets; correct set; attempts; feedback; accessibility.</w:t>
+        <w:t>Entrance/exit/emphasis; duration; delay; direction; path; orient to path; transition.</w:t>
       </w:r>
     </w:p>
     <w:p>
@@ -3832,7 +4415,7 @@
         <w:t xml:space="preserve">Watch for: </w:t>
       </w:r>
       <w:r>
-        <w:t>Beautiful interaction with ambiguous instructions, overlapping targets or keyboard-inaccessible drag behaviour.</w:t>
+        <w:t>Decorative motion, competing animations, motion-trigger mismatch or inaccessible information shown too briefly.</w:t>
       </w:r>
     </w:p>
     <w:p>
@@ -3843,7 +4426,7 @@
         <w:t xml:space="preserve">Quality evidence: </w:t>
       </w:r>
       <w:r>
-        <w:t>The interaction has an accessible equivalent and correct/incorrect outcomes match the rubric.</w:t>
+        <w:t>Motion clarifies one teaching point and the static slide still communicates the complete meaning.</w:t>
       </w:r>
     </w:p>
     <w:p>
@@ -3851,12 +4434,12 @@
         <w:pStyle w:val="Heading2"/>
       </w:pPr>
       <w:r>
-        <w:t>Branching Scenarios and Consequences</w:t>
-      </w:r>
-    </w:p>
-    <w:p>
-      <w:r>
-        <w:t>Branches let learner choices reveal consequences, coaching and alternative routes before reconnecting to a common outcome.</w:t>
+        <w:t>Freeform Interactions and Question Conversion</w:t>
+      </w:r>
+    </w:p>
+    <w:p>
+      <w:r>
+        <w:t>Existing objects can become selectable, drag-and-drop, text-entry or hotspot responses with scoring and feedback.</w:t>
       </w:r>
     </w:p>
     <w:p>
@@ -3867,7 +4450,7 @@
         <w:t xml:space="preserve">Best used for: </w:t>
       </w:r>
       <w:r>
-        <w:t>Conversations, safety decisions, customer handling and ethical choices.</w:t>
+        <w:t>Authentic decisions where standard question layouts are too restrictive.</w:t>
       </w:r>
     </w:p>
     <w:p>
@@ -3878,7 +4461,7 @@
         <w:t xml:space="preserve">Key controls: </w:t>
       </w:r>
       <w:r>
-        <w:t>Decision node; choice; consequence; feedback; variable; branch map; merge point; retry.</w:t>
+        <w:t>Convert to freeform; response objects; drop targets; correct set; attempts; feedback; accessibility.</w:t>
       </w:r>
     </w:p>
     <w:p>
@@ -3889,7 +4472,7 @@
         <w:t xml:space="preserve">Watch for: </w:t>
       </w:r>
       <w:r>
-        <w:t>Branches that differ only cosmetically, dead ends, exponential complexity or moralising feedback.</w:t>
+        <w:t>Beautiful interaction with ambiguous instructions, overlapping targets or keyboard-inaccessible drag behaviour.</w:t>
       </w:r>
     </w:p>
     <w:p>
@@ -3900,7 +4483,121 @@
         <w:t xml:space="preserve">Quality evidence: </w:t>
       </w:r>
       <w:r>
+        <w:t>The interaction has an accessible equivalent and correct/incorrect outcomes match the rubric.</w:t>
+      </w:r>
+    </w:p>
+    <w:p>
+      <w:pPr>
+        <w:pStyle w:val="Heading2"/>
+      </w:pPr>
+      <w:r>
+        <w:t>Branching Scenarios and Consequences</w:t>
+      </w:r>
+    </w:p>
+    <w:p>
+      <w:r>
+        <w:t>Branches let learner choices reveal consequences, coaching and alternative routes before reconnecting to a common outcome.</w:t>
+      </w:r>
+    </w:p>
+    <w:p>
+      <w:r>
+        <w:rPr>
+          <w:b/>
+        </w:rPr>
+        <w:t xml:space="preserve">Best used for: </w:t>
+      </w:r>
+      <w:r>
+        <w:t>Conversations, safety decisions, customer handling and ethical choices.</w:t>
+      </w:r>
+    </w:p>
+    <w:p>
+      <w:r>
+        <w:rPr>
+          <w:b/>
+        </w:rPr>
+        <w:t xml:space="preserve">Key controls: </w:t>
+      </w:r>
+      <w:r>
+        <w:t>Decision node; choice; consequence; feedback; variable; branch map; merge point; retry.</w:t>
+      </w:r>
+    </w:p>
+    <w:p>
+      <w:r>
+        <w:rPr>
+          <w:b/>
+        </w:rPr>
+        <w:t xml:space="preserve">Watch for: </w:t>
+      </w:r>
+      <w:r>
+        <w:t>Branches that differ only cosmetically, dead ends, exponential complexity or moralising feedback.</w:t>
+      </w:r>
+    </w:p>
+    <w:p>
+      <w:r>
+        <w:rPr>
+          <w:b/>
+        </w:rPr>
+        <w:t xml:space="preserve">Quality evidence: </w:t>
+      </w:r>
+      <w:r>
         <w:t>Every route has a defined purpose, duration and outcome; the storyboard accounts for all nodes.</w:t>
+      </w:r>
+    </w:p>
+    <w:p>
+      <w:pPr>
+        <w:pStyle w:val="Heading2"/>
+      </w:pPr>
+      <w:r>
+        <w:t>Learner-Controlled Pull and Progressive Disclosure</w:t>
+      </w:r>
+    </w:p>
+    <w:p>
+      <w:r>
+        <w:t>Learners pull concise supporting content when they need it, while essential decisions and objectives remain visible and navigation stays understandable.</w:t>
+      </w:r>
+    </w:p>
+    <w:p>
+      <w:r>
+        <w:rPr>
+          <w:b/>
+        </w:rPr>
+        <w:t xml:space="preserve">Best used for: </w:t>
+      </w:r>
+      <w:r>
+        <w:t>Optional examples, definitions, job aids, deeper explanations and non-linear exploration.</w:t>
+      </w:r>
+    </w:p>
+    <w:p>
+      <w:r>
+        <w:rPr>
+          <w:b/>
+        </w:rPr>
+        <w:t xml:space="preserve">Key controls: </w:t>
+      </w:r>
+      <w:r>
+        <w:t>Need-to-know core; optional layer; label; menu cue; visited state; completion rule; skip path; return point.</w:t>
+      </w:r>
+    </w:p>
+    <w:p>
+      <w:r>
+        <w:rPr>
+          <w:b/>
+        </w:rPr>
+        <w:t xml:space="preserve">Watch for: </w:t>
+      </w:r>
+      <w:r>
+        <w:t>Locking every path, hiding required information behind exploration, overwhelming one screen or using unlabeled hotspots.</w:t>
+      </w:r>
+    </w:p>
+    <w:p>
+      <w:r>
+        <w:rPr>
+          <w:b/>
+        </w:rPr>
+        <w:t xml:space="preserve">Quality evidence: </w:t>
+      </w:r>
+      <w:r>
+        <w:t>The learner can locate needed support, skip known material and still understand what is required for completion.</w:t>
       </w:r>
     </w:p>
     <w:p>
@@ -4055,7 +4752,7 @@
     </w:p>
     <w:p>
       <w:r>
-        <w:t>2. Define the learning objective and write one decision-focused question with one defensible correct answer.</w:t>
+        <w:t>2. Define the learning objective and write one realistic decision-focused question with one defensible correct answer.</w:t>
       </w:r>
     </w:p>
     <w:p>
@@ -4065,7 +4762,7 @@
     </w:p>
     <w:p>
       <w:r>
-        <w:t>4. Write concise feedback that explains why each response is correct or incorrect.</w:t>
+        <w:t>4. Write concise feedback that explains the contextual consequence of each response, not merely whether it is correct.</w:t>
       </w:r>
     </w:p>
     <w:p>
@@ -4119,7 +4816,7 @@
         <w:pStyle w:val="ListBullet"/>
       </w:pPr>
       <w:r>
-        <w:t>Question and feedback align to the taught criterion.</w:t>
+        <w:t>The realistic decision and consequence-based feedback align to the taught criterion.</w:t>
       </w:r>
     </w:p>
     <w:p>
@@ -4135,7 +4832,7 @@
         <w:pStyle w:val="ListBullet"/>
       </w:pPr>
       <w:r>
-        <w:t>All response states are perceivable and keyboard operable.</w:t>
+        <w:t>All response states are perceivable and keyboard/touch operable.</w:t>
       </w:r>
     </w:p>
     <w:p>
@@ -4282,7 +4979,7 @@
     </w:p>
     <w:p>
       <w:r>
-        <w:t>8. Preview pass, fail, retry, partial selection, resume and review paths.</w:t>
+        <w:t>8. Preview pass, fail, retry, partial selection, resume and review paths; verify touch targets and spacing at a phone-sized player view.</w:t>
       </w:r>
     </w:p>
     <w:p>
@@ -4316,7 +5013,7 @@
         <w:pStyle w:val="ListBullet"/>
       </w:pPr>
       <w:r>
-        <w:t>Both questions assess the mapped criteria.</w:t>
+        <w:t>Both questions assess the mapped criteria through meaningful learner choices.</w:t>
       </w:r>
     </w:p>
     <w:p>
@@ -4340,7 +5037,7 @@
         <w:pStyle w:val="ListBullet"/>
       </w:pPr>
       <w:r>
-        <w:t>Keyboard, focus and instruction checks pass.</w:t>
+        <w:t>Keyboard, focus, touch-target and instruction checks pass.</w:t>
       </w:r>
     </w:p>
     <w:p>
@@ -4364,7 +5061,7 @@
     </w:p>
     <w:p>
       <w:r>
-        <w:t>Themes · masters · player · accessibility · Review 360 · preview · LMS/LRS publishing · scheduling · governance</w:t>
+        <w:t>Themes · masters · player · multi-device UX · accessibility · Review 360 · preview · LMS/LRS publishing · scheduling · governance</w:t>
       </w:r>
     </w:p>
     <w:p>
@@ -4484,6 +5181,63 @@
       </w:r>
       <w:r>
         <w:t>The player supports the storyboard, accessibility plan and completion rules on desktop and mobile.</w:t>
+      </w:r>
+    </w:p>
+    <w:p>
+      <w:pPr>
+        <w:pStyle w:val="Heading2"/>
+      </w:pPr>
+      <w:r>
+        <w:t>Multi-Device UX and Real-Device Testing</w:t>
+      </w:r>
+    </w:p>
+    <w:p>
+      <w:r>
+        <w:t>Multi-device design combines immediacy, clear affordances and touch-friendly interaction, then verifies the experience in the devices, orientations and contexts learners actually use.</w:t>
+      </w:r>
+    </w:p>
+    <w:p>
+      <w:r>
+        <w:rPr>
+          <w:b/>
+        </w:rPr>
+        <w:t xml:space="preserve">Best used for: </w:t>
+      </w:r>
+      <w:r>
+        <w:t>Responsive-player courses, mobile performance support and mixed desktop/tablet/phone audiences.</w:t>
+      </w:r>
+    </w:p>
+    <w:p>
+      <w:r>
+        <w:rPr>
+          <w:b/>
+        </w:rPr>
+        <w:t xml:space="preserve">Key controls: </w:t>
+      </w:r>
+      <w:r>
+        <w:t>Screen size; orientation; touch target; spacing; hover alternative; readable type; virtual keyboard; gesture cue; bandwidth; real-device matrix.</w:t>
+      </w:r>
+    </w:p>
+    <w:p>
+      <w:r>
+        <w:rPr>
+          <w:b/>
+        </w:rPr>
+        <w:t xml:space="preserve">Watch for: </w:t>
+      </w:r>
+      <w:r>
+        <w:t>Shrinking desktop layouts, hiding critical content in hover states, tiny controls, long text entry or trusting a responsive preview as final proof.</w:t>
+      </w:r>
+    </w:p>
+    <w:p>
+      <w:r>
+        <w:rPr>
+          <w:b/>
+        </w:rPr>
+        <w:t xml:space="preserve">Quality evidence: </w:t>
+      </w:r>
+      <w:r>
+        <w:t>Desktop, tablet and phone tests record readability, touch accuracy, orientation, media performance, keyboard behaviour and completion/resume results.</w:t>
       </w:r>
     </w:p>
     <w:p>
@@ -5057,27 +5811,32 @@
     </w:p>
     <w:p>
       <w:r>
-        <w:t>6. Prepare a Review 360 plan naming reviewers, review questions, owner, deadline and comment disposition.</w:t>
-      </w:r>
-    </w:p>
-    <w:p>
-      <w:r>
-        <w:t>7. Select a distribution target and justify web, video, Review 360 or LMS/LRS against interaction and tracking needs.</w:t>
-      </w:r>
-    </w:p>
-    <w:p>
-      <w:r>
-        <w:t>8. For LMS/LRS, specify the supported standard, completion trigger, passing rule and sandbox test; do not upload to a live LMS in this lab.</w:t>
-      </w:r>
-    </w:p>
-    <w:p>
-      <w:r>
-        <w:t>9. Define delivery frequency, reminders, content owner, review date and update trigger.</w:t>
-      </w:r>
-    </w:p>
-    <w:p>
-      <w:r>
-        <w:t>10. Compare with `07_02_END.story`, save the completed .story file and publish plan.</w:t>
+        <w:t>6. Run a real-device matrix on desktop, tablet and phone in portrait/landscape where supported; record readability, touch accuracy, media, orientation and resume results.</w:t>
+      </w:r>
+    </w:p>
+    <w:p>
+      <w:r>
+        <w:t>7. Prepare a Review 360 plan naming reviewers, review questions, owner, deadline and comment disposition.</w:t>
+      </w:r>
+    </w:p>
+    <w:p>
+      <w:r>
+        <w:t>8. Select a distribution target and justify web, video, Review 360 or LMS/LRS against interaction and tracking needs.</w:t>
+      </w:r>
+    </w:p>
+    <w:p>
+      <w:r>
+        <w:t>9. For LMS/LRS, specify the supported standard, completion trigger, passing rule and sandbox test; do not upload to a live LMS in this lab.</w:t>
+      </w:r>
+    </w:p>
+    <w:p>
+      <w:r>
+        <w:t>10. Define delivery frequency, reminders, content owner, review date and update trigger.</w:t>
+      </w:r>
+    </w:p>
+    <w:p>
+      <w:r>
+        <w:t>11. Compare with `07_02_END.story`, save the completed .story file and publish plan.</w:t>
       </w:r>
     </w:p>
     <w:p>
@@ -5114,7 +5873,7 @@
         <w:pStyle w:val="ListBullet"/>
       </w:pPr>
       <w:r>
-        <w:t>Navigation and accessibility tests pass.</w:t>
+        <w:t>Navigation, accessibility and real-device tests pass.</w:t>
       </w:r>
     </w:p>
     <w:p>
@@ -5566,6 +6325,204 @@
           </w:p>
         </w:tc>
       </w:tr>
+      <w:tr>
+        <w:trPr>
+          <w:cantSplit/>
+        </w:trPr>
+        <w:tc>
+          <w:tcPr>
+            <w:tcW w:type="dxa" w:w="4320"/>
+            <w:vAlign w:val="center"/>
+          </w:tcPr>
+          <w:p>
+            <w:r>
+              <w:rPr>
+                <w:sz w:val="19"/>
+              </w:rPr>
+              <w:t>Articulate ebook: E-Learning for Beginners</w:t>
+            </w:r>
+          </w:p>
+        </w:tc>
+        <w:tc>
+          <w:tcPr>
+            <w:tcW w:type="dxa" w:w="4320"/>
+            <w:vAlign w:val="center"/>
+          </w:tcPr>
+          <w:p>
+            <w:r>
+              <w:rPr>
+                <w:sz w:val="19"/>
+              </w:rPr>
+              <w:t>reference/Articulate ebooks/E-LearningForBeginners_E-Book.pdf</w:t>
+            </w:r>
+          </w:p>
+        </w:tc>
+      </w:tr>
+      <w:tr>
+        <w:trPr>
+          <w:cantSplit/>
+        </w:trPr>
+        <w:tc>
+          <w:tcPr>
+            <w:tcW w:type="dxa" w:w="4320"/>
+            <w:vAlign w:val="center"/>
+          </w:tcPr>
+          <w:p>
+            <w:r>
+              <w:rPr>
+                <w:sz w:val="19"/>
+              </w:rPr>
+              <w:t>Articulate ebook: Getting Started with Articulate Storyline</w:t>
+            </w:r>
+          </w:p>
+        </w:tc>
+        <w:tc>
+          <w:tcPr>
+            <w:tcW w:type="dxa" w:w="4320"/>
+            <w:vAlign w:val="center"/>
+          </w:tcPr>
+          <w:p>
+            <w:r>
+              <w:rPr>
+                <w:sz w:val="19"/>
+              </w:rPr>
+              <w:t>reference/Articulate ebooks/Getting_Started_with_Articulate_Storyline.pdf</w:t>
+            </w:r>
+          </w:p>
+        </w:tc>
+      </w:tr>
+      <w:tr>
+        <w:trPr>
+          <w:cantSplit/>
+        </w:trPr>
+        <w:tc>
+          <w:tcPr>
+            <w:tcW w:type="dxa" w:w="4320"/>
+            <w:vAlign w:val="center"/>
+          </w:tcPr>
+          <w:p>
+            <w:r>
+              <w:rPr>
+                <w:sz w:val="19"/>
+              </w:rPr>
+              <w:t>Articulate ebook: 5 Highly Effective Strategies for Creating Engaging E-Learning</w:t>
+            </w:r>
+          </w:p>
+        </w:tc>
+        <w:tc>
+          <w:tcPr>
+            <w:tcW w:type="dxa" w:w="4320"/>
+            <w:vAlign w:val="center"/>
+          </w:tcPr>
+          <w:p>
+            <w:r>
+              <w:rPr>
+                <w:sz w:val="19"/>
+              </w:rPr>
+              <w:t>reference/Articulate ebooks/Articulate_5_Highly_Effective_Strategies_for_Creating_Engaging_E-Learning_2018.pdf</w:t>
+            </w:r>
+          </w:p>
+        </w:tc>
+      </w:tr>
+      <w:tr>
+        <w:trPr>
+          <w:cantSplit/>
+        </w:trPr>
+        <w:tc>
+          <w:tcPr>
+            <w:tcW w:type="dxa" w:w="4320"/>
+            <w:vAlign w:val="center"/>
+          </w:tcPr>
+          <w:p>
+            <w:r>
+              <w:rPr>
+                <w:sz w:val="19"/>
+              </w:rPr>
+              <w:t>Articulate ebook: The Secret to Create Great E-Learning Videos</w:t>
+            </w:r>
+          </w:p>
+        </w:tc>
+        <w:tc>
+          <w:tcPr>
+            <w:tcW w:type="dxa" w:w="4320"/>
+            <w:vAlign w:val="center"/>
+          </w:tcPr>
+          <w:p>
+            <w:r>
+              <w:rPr>
+                <w:sz w:val="19"/>
+              </w:rPr>
+              <w:t>reference/Articulate ebooks/Articulate_The_Secret_to_Create_Great_E-Learning_Videos_v4.pdf</w:t>
+            </w:r>
+          </w:p>
+        </w:tc>
+      </w:tr>
+      <w:tr>
+        <w:trPr>
+          <w:cantSplit/>
+        </w:trPr>
+        <w:tc>
+          <w:tcPr>
+            <w:tcW w:type="dxa" w:w="4320"/>
+            <w:vAlign w:val="center"/>
+          </w:tcPr>
+          <w:p>
+            <w:r>
+              <w:rPr>
+                <w:sz w:val="19"/>
+              </w:rPr>
+              <w:t>Articulate ebook: 6 Best Practices for Designing Accessible E-Learning</w:t>
+            </w:r>
+          </w:p>
+        </w:tc>
+        <w:tc>
+          <w:tcPr>
+            <w:tcW w:type="dxa" w:w="4320"/>
+            <w:vAlign w:val="center"/>
+          </w:tcPr>
+          <w:p>
+            <w:r>
+              <w:rPr>
+                <w:sz w:val="19"/>
+              </w:rPr>
+              <w:t>reference/Articulate ebooks/6_Best_Practices_for_Designing_Accessible_E-Learning.pdf</w:t>
+            </w:r>
+          </w:p>
+        </w:tc>
+      </w:tr>
+      <w:tr>
+        <w:trPr>
+          <w:cantSplit/>
+        </w:trPr>
+        <w:tc>
+          <w:tcPr>
+            <w:tcW w:type="dxa" w:w="4320"/>
+            <w:vAlign w:val="center"/>
+          </w:tcPr>
+          <w:p>
+            <w:r>
+              <w:rPr>
+                <w:sz w:val="19"/>
+              </w:rPr>
+              <w:t>Articulate ebook: The Definitive Guide to Multi-Device E-Learning</w:t>
+            </w:r>
+          </w:p>
+        </w:tc>
+        <w:tc>
+          <w:tcPr>
+            <w:tcW w:type="dxa" w:w="4320"/>
+            <w:vAlign w:val="center"/>
+          </w:tcPr>
+          <w:p>
+            <w:r>
+              <w:rPr>
+                <w:sz w:val="19"/>
+              </w:rPr>
+              <w:t>reference/Articulate ebooks/The-Definitive-Guide-to-Multi-Device-E-Learning.pdf</w:t>
+            </w:r>
+          </w:p>
+        </w:tc>
+      </w:tr>
     </w:tbl>
     <w:sectPr>
       <w:footerReference w:type="default" r:id="rId14"/>

</xml_diff>